<commit_message>
fix: minor change in sample contract
</commit_message>
<xml_diff>
--- a/HĐ/sample/sample.docx
+++ b/HĐ/sample/sample.docx
@@ -2888,30 +2888,30 @@
           <w:sz w:val="24"/>
           <w:szCs w:val="24"/>
         </w:rPr>
-        <w:t>nước:</w:t>
-      </w:r>
-      <w:r>
-        <w:rPr>
-          <w:spacing w:val="40"/>
-          <w:sz w:val="24"/>
-          <w:szCs w:val="24"/>
-        </w:rPr>
-        <w:t xml:space="preserve"> </w:t>
-      </w:r>
-      <w:r>
-        <w:rPr>
-          <w:sz w:val="24"/>
-          <w:szCs w:val="24"/>
-        </w:rPr>
-        <w:t>50.000</w:t>
-      </w:r>
-      <w:r>
-        <w:rPr>
-          <w:spacing w:val="40"/>
-          <w:sz w:val="24"/>
-          <w:szCs w:val="24"/>
-        </w:rPr>
-        <w:t xml:space="preserve"> </w:t>
+        <w:t>nướ</w:t>
+      </w:r>
+      <w:r>
+        <w:rPr>
+          <w:sz w:val="24"/>
+          <w:szCs w:val="24"/>
+          <w:lang w:val="en-US"/>
+        </w:rPr>
+        <w:t xml:space="preserve">c: </w:t>
+      </w:r>
+      <w:r>
+        <w:rPr>
+          <w:sz w:val="24"/>
+          <w:szCs w:val="24"/>
+        </w:rPr>
+        <w:t>50.00</w:t>
+      </w:r>
+      <w:r>
+        <w:rPr>
+          <w:sz w:val="24"/>
+          <w:szCs w:val="24"/>
+          <w:lang w:val="en-US"/>
+        </w:rPr>
+        <w:t xml:space="preserve">0 </w:t>
       </w:r>
       <w:r>
         <w:rPr>

</xml_diff>